<commit_message>
fixed: interconnected househould code to the residents and fix some archive deleted by
</commit_message>
<xml_diff>
--- a/Claude outputs/PiaoConnect_System_Update_Summary.docx
+++ b/Claude outputs/PiaoConnect_System_Update_Summary.docx
@@ -49,7 +49,7 @@
           <w:sz w:val="22"/>
           <w:szCs w:val="22"/>
         </w:rPr>
-        <w:t xml:space="preserve">Prepared for Barangay Piao — September 3, 2026</w:t>
+        <w:t xml:space="preserve">Prepared for Barangay Piao — September 4, 2026</w:t>
       </w:r>
     </w:p>
     <w:p>
@@ -343,20 +343,104 @@
           <w:sz w:val="24"/>
           <w:szCs w:val="24"/>
         </w:rPr>
-        <w:t xml:space="preserve">Budget &amp; Expenses list is easier to read</w:t>
-      </w:r>
-    </w:p>
-    <w:p>
-      <w:pPr>
-        <w:spacing w:after="160" w:line="300"/>
-      </w:pPr>
-      <w:r>
-        <w:rPr>
-          <w:color w:val="2A2A2A"/>
-          <w:sz w:val="22"/>
-          <w:szCs w:val="22"/>
-        </w:rPr>
-        <w:t xml:space="preserve">Events in the Budget &amp; Expenses picker are now grouped by day, with a "This Week" section pulled to the top, matching the Events page. Raw database-style timestamps (like "2026-06-03 07:00:00") have been replaced with plain, friendly text (a day heading plus a time such as "7:00 AM") — much easier for anyone to read at a glance, regardless of computer experience.</w:t>
+        <w:t xml:space="preserve">Budget &amp; Expenses list is easier to read, and sorted newest first</w:t>
+      </w:r>
+    </w:p>
+    <w:p>
+      <w:pPr>
+        <w:spacing w:after="160" w:line="300"/>
+      </w:pPr>
+      <w:r>
+        <w:rPr>
+          <w:color w:val="2A2A2A"/>
+          <w:sz w:val="22"/>
+          <w:szCs w:val="22"/>
+        </w:rPr>
+        <w:t xml:space="preserve">Events in the Budget &amp; Expenses picker are grouped by day, with a "This Week" section pulled to the top, matching the Events page. Raw database-style timestamps (like "2026-06-03 07:00:00") have been replaced with plain, friendly text (a day heading plus a time such as "7:00 AM"). The day groups below "This Week" now also run newest-to-oldest instead of oldest-to-newest, so the most recent activity is always closest to the top.</w:t>
+      </w:r>
+    </w:p>
+    <w:p>
+      <w:pPr>
+        <w:spacing w:after="60" w:before="280"/>
+      </w:pPr>
+      <w:r>
+        <w:rPr>
+          <w:b/>
+          <w:bCs/>
+          <w:color w:val="004A4D"/>
+          <w:sz w:val="24"/>
+          <w:szCs w:val="24"/>
+        </w:rPr>
+        <w:t xml:space="preserve">Reports &amp; Analytics — and the whole demo database — now has much more to show</w:t>
+      </w:r>
+    </w:p>
+    <w:p>
+      <w:pPr>
+        <w:spacing w:after="160" w:line="300"/>
+      </w:pPr>
+      <w:r>
+        <w:rPr>
+          <w:color w:val="2A2A2A"/>
+          <w:sz w:val="22"/>
+          <w:szCs w:val="22"/>
+        </w:rPr>
+        <w:t xml:space="preserve">Past events previously carried only a handful of sample rows in total, so Reports &amp; Analytics (attendance trends, budget vs. actual spending, resident feedback ratings) and the Activity Logs page both looked mostly empty. Every past event now has realistic sign-in/sign-out records for its actual eligible residents, a full set of budget line items measured against an approved budget, a realistic set of inventory items borrowed for it (correctly deducted from stock, the same way it works when staff borrow an item by hand), and matching feedback ratings — with a full activity log entry generated for every one of those actions, timestamped to when it would realistically have happened. The result is a demo database with enough real-looking activity across every module to actually be useful to review, print, or present, instead of a handful of numbers repeated everywhere.</w:t>
+      </w:r>
+    </w:p>
+    <w:p>
+      <w:pPr>
+        <w:spacing w:after="60" w:before="280"/>
+      </w:pPr>
+      <w:r>
+        <w:rPr>
+          <w:b/>
+          <w:bCs/>
+          <w:color w:val="004A4D"/>
+          <w:sz w:val="24"/>
+          <w:szCs w:val="24"/>
+        </w:rPr>
+        <w:t xml:space="preserve">Linking a resident to a household on the Residents page now actually works</w:t>
+      </w:r>
+    </w:p>
+    <w:p>
+      <w:pPr>
+        <w:spacing w:after="160" w:line="300"/>
+      </w:pPr>
+      <w:r>
+        <w:rPr>
+          <w:color w:val="2A2A2A"/>
+          <w:sz w:val="22"/>
+          <w:szCs w:val="22"/>
+        </w:rPr>
+        <w:t xml:space="preserve">The Add/Edit Resident form has always had a "Household Code" box and a "Head of Household" checkbox. These looked like they connected a resident to a household, but they were left over from an older version of the system and were never actually wired to the real Households page — typing a code or checking the box quietly saved nothing useful, which is why a household could show "No head assigned" on the Households page even after someone had ticked that box on a resident's profile. That box has been replaced with a proper search-and-pick field: staff now search for and select an existing household by its real code, and the "Head of Household" checkbox only turns on once a household has actually been picked. Anything set here now shows up correctly on the Households page, and vice versa — the two pages are finally talking about the same household record instead of two disconnected ones.</w:t>
+      </w:r>
+    </w:p>
+    <w:p>
+      <w:pPr>
+        <w:spacing w:after="60" w:before="280"/>
+      </w:pPr>
+      <w:r>
+        <w:rPr>
+          <w:b/>
+          <w:bCs/>
+          <w:color w:val="004A4D"/>
+          <w:sz w:val="24"/>
+          <w:szCs w:val="24"/>
+        </w:rPr>
+        <w:t xml:space="preserve">Event SMS to household heads now uses the number set on the Households page</w:t>
+      </w:r>
+    </w:p>
+    <w:p>
+      <w:pPr>
+        <w:spacing w:after="160" w:line="300"/>
+      </w:pPr>
+      <w:r>
+        <w:rPr>
+          <w:color w:val="2A2A2A"/>
+          <w:sz w:val="22"/>
+          <w:szCs w:val="22"/>
+        </w:rPr>
+        <w:t xml:space="preserve">Each household on the Households page has its own shared contact number field, but event SMS sent to a household's head was quietly using a different, hidden number instead — meaning changing the number on the Households page had no effect on where the text actually went. Event SMS to a household head now uses that same Households-page number first, so the number staff see and edit there is the number that's actually used.</w:t>
       </w:r>
     </w:p>
     <w:p>
@@ -530,7 +614,7 @@
           <w:sz w:val="22"/>
           <w:szCs w:val="22"/>
         </w:rPr>
-        <w:t xml:space="preserve">Past events a resident actually attended (whether they signed out on time or not) now show a simple star-rating box where they can leave a rating and an optional comment. This only appears for events they genuinely attended — an event a resident missed entirely never shows a rating option, so feedback always reflects real attendance. Residents can also come back and edit a rating they already submitted.</w:t>
+        <w:t xml:space="preserve">Past events a resident actually attended (whether they signed out on time or not) now show a simple star-rating box where they can leave a rating and an optional comment. This only appears for events they genuinely attended — an event a resident missed entirely never shows a rating option, so feedback always reflects real attendance. Residents can also come back and edit a rating they already submitted, and see a brief confirmation once a rating is saved.</w:t>
       </w:r>
     </w:p>
     <w:p>
@@ -671,7 +755,7 @@
           <w:sz w:val="20"/>
           <w:szCs w:val="20"/>
         </w:rPr>
-        <w:t xml:space="preserve">All of the above changes have been verified to build correctly. Because these updates were made through a remote connection without a live preview, please take a moment to click through the affected pages after this update is deployed to confirm everything looks and behaves as expected.</w:t>
+        <w:t xml:space="preserve">All of the above changes have been verified to build correctly. Because these updates were made through a remote connection without a live preview, please take a moment to click through the affected pages after this update is deployed to confirm everything looks and behaves as expected. The expanded demo data (attendance, budget, borrowed items, and activity logs) will only appear after the database is reseeded (php artisan migrate:fresh --seed) — please run that, or ask your developer to, before reviewing the reports.</w:t>
       </w:r>
     </w:p>
     <w:sectPr>

</xml_diff>